<commit_message>
Update agent metadata and migration report
Replit-Commit-Author: Agent
</commit_message>
<xml_diff>
--- a/attached_assets/generated/PulseEDU_Migration_Report_2026-08-06.docx
+++ b/attached_assets/generated/PulseEDU_Migration_Report_2026-08-06.docx
@@ -2553,6 +2553,121 @@
     </w:p>
     <w:p>
       <w:pPr>
+        <w:pStyle w:val="Heading2"/>
+      </w:pPr>
+      <w:r>
+        <w:t>5.4 Functional changes shipped in this window (explicit list)</w:t>
+      </w:r>
+    </w:p>
+    <w:p>
+      <w:r>
+        <w:rPr>
+          <w:b w:val="0"/>
+          <w:i w:val="0"/>
+        </w:rPr>
+        <w:t>These ship in the same build; none require database changes beyond Sections 3-4. Listed here so nothing is missed in production acceptance testing:</w:t>
+      </w:r>
+    </w:p>
+    <w:p>
+      <w:pPr>
+        <w:pStyle w:val="ListBullet"/>
+      </w:pPr>
+      <w:r>
+        <w:rPr>
+          <w:b/>
+        </w:rPr>
+        <w:t xml:space="preserve">Photos: </w:t>
+      </w:r>
+      <w:r>
+        <w:t>Student photos with tap-to-enlarge (EnlargeableStudentPhoto) added to the Student Finder and the Pull-Out Request flow.</w:t>
+      </w:r>
+    </w:p>
+    <w:p>
+      <w:pPr>
+        <w:pStyle w:val="ListBullet"/>
+      </w:pPr>
+      <w:r>
+        <w:rPr>
+          <w:b/>
+        </w:rPr>
+        <w:t xml:space="preserve">Invisible Student fix: </w:t>
+      </w:r>
+      <w:r>
+        <w:t>"Invisible Student" report corrected — only POSITIVE interactions clear invisibility now; negative quick-log entries (which also write pbis_entries) no longer count as contact, fixing the incorrect reporting.</w:t>
+      </w:r>
+    </w:p>
+    <w:p>
+      <w:pPr>
+        <w:pStyle w:val="ListBullet"/>
+      </w:pPr>
+      <w:r>
+        <w:rPr>
+          <w:b/>
+        </w:rPr>
+        <w:t xml:space="preserve">Tardy history: </w:t>
+      </w:r>
+      <w:r>
+        <w:t>Tardy / Check-In History now sorts most-recent-first and adds new date-range filters: All / Today / This week / This month / custom from-to range.</w:t>
+      </w:r>
+    </w:p>
+    <w:p>
+      <w:pPr>
+        <w:pStyle w:val="ListBullet"/>
+      </w:pPr>
+      <w:r>
+        <w:rPr>
+          <w:b/>
+        </w:rPr>
+        <w:t xml:space="preserve">PBIS integrity: </w:t>
+      </w:r>
+      <w:r>
+        <w:t>Point selector controls on PBIS awarding — school-wide "allow point adjust" toggle and per-award point cap, enforced on ALL award endpoints server-side (single, bulk, and edit; Core Team exempt) so staff cannot skew the PBIS system. Backed by the two new school_settings columns in Section 3.2.</w:t>
+      </w:r>
+    </w:p>
+    <w:p>
+      <w:pPr>
+        <w:pStyle w:val="ListBullet"/>
+      </w:pPr>
+      <w:r>
+        <w:rPr>
+          <w:b/>
+        </w:rPr>
+        <w:t xml:space="preserve">BIP on rosters: </w:t>
+      </w:r>
+      <w:r>
+        <w:t>Behavior (BIP) pill added to Teacher Rosters — purple pill with hover detail from the new behavior_supports table.</w:t>
+      </w:r>
+    </w:p>
+    <w:p>
+      <w:pPr>
+        <w:pStyle w:val="ListBullet"/>
+      </w:pPr>
+      <w:r>
+        <w:rPr>
+          <w:b/>
+        </w:rPr>
+        <w:t xml:space="preserve">Pull-out counters: </w:t>
+      </w:r>
+      <w:r>
+        <w:t>Pull-out counters on the Teacher Roster (year-to-date per student, counted by referring teacher).</w:t>
+      </w:r>
+    </w:p>
+    <w:p>
+      <w:pPr>
+        <w:pStyle w:val="ListBullet"/>
+      </w:pPr>
+      <w:r>
+        <w:rPr>
+          <w:b/>
+        </w:rPr>
+        <w:t xml:space="preserve">Report scoping: </w:t>
+      </w:r>
+      <w:r>
+        <w:t>Hall Pass Reports opened to all staff with server-side scoping — non-privileged staff only ever receive numbers computed over their own visible students.</w:t>
+      </w:r>
+    </w:p>
+    <w:p>
+      <w:pPr>
         <w:pStyle w:val="Heading1"/>
       </w:pPr>
       <w:r>

</xml_diff>

<commit_message>
Update agent metadata and regenerate mockup components and migration report
Replit-Commit-Author: Agent
</commit_message>
<xml_diff>
--- a/attached_assets/generated/PulseEDU_Migration_Report_2026-08-06.docx
+++ b/attached_assets/generated/PulseEDU_Migration_Report_2026-08-06.docx
@@ -2668,6 +2668,20 @@
     </w:p>
     <w:p>
       <w:pPr>
+        <w:pStyle w:val="ListBullet"/>
+      </w:pPr>
+      <w:r>
+        <w:rPr>
+          <w:b/>
+        </w:rPr>
+        <w:t xml:space="preserve">Escort-required safety plans: </w:t>
+      </w:r>
+      <w:r>
+        <w:t>for students whose safety plan requires an escort — (a) at the kiosk, the student is blocked from self-issuing a pass and prompted to see their teacher; (b) when a staff member creates the pass, they must acknowledge they called ahead and arranged the escort (forced acknowledgment) before the pass is issued. Enforced on every pass-creation path server-side. Backed by the safety_plans.escort_required column in Section 3.</w:t>
+      </w:r>
+    </w:p>
+    <w:p>
+      <w:pPr>
         <w:pStyle w:val="Heading1"/>
       </w:pPr>
       <w:r>

</xml_diff>

<commit_message>
Update agent asset metadata and migration report
Replit-Commit-Author: Agent
</commit_message>
<xml_diff>
--- a/attached_assets/generated/PulseEDU_Migration_Report_2026-08-06.docx
+++ b/attached_assets/generated/PulseEDU_Migration_Report_2026-08-06.docx
@@ -2682,6 +2682,20 @@
     </w:p>
     <w:p>
       <w:pPr>
+        <w:pStyle w:val="ListBullet"/>
+      </w:pPr>
+      <w:r>
+        <w:rPr>
+          <w:b/>
+        </w:rPr>
+        <w:t xml:space="preserve">Starter Lists (one-time dropdown fill): </w:t>
+      </w:r>
+      <w:r>
+        <w:t>an admin-only "load starter pack" button that fills a school's configurable pick lists (PBIS positive/negative reasons, intervention types, pull-out reasons, case outcome types, separation reason tags, communication types, Tier 3 strategy categories and strategies) with a curated default set, giving a new school a working starting place. Insert-only and safe to run more than once — it skips any entry the school already has (case-insensitive match) and never updates or deletes anything. No database schema changes; uses existing pick-list tables.</w:t>
+      </w:r>
+    </w:p>
+    <w:p>
+      <w:pPr>
         <w:pStyle w:val="Heading1"/>
       </w:pPr>
       <w:r>

</xml_diff>